<commit_message>
Explica qué hace cada herramienta de prueba y cómo obtiene su resultado.
</commit_message>
<xml_diff>
--- a/entrega/Guia_de_Estudio_Atlas.docx
+++ b/entrega/Guia_de_Estudio_Atlas.docx
@@ -29,7 +29,7 @@
           <w:color w:val="182B46"/>
           <w:sz w:val="32"/>
         </w:rPr>
-        <w:t>GUÍA DE ESTUDIO — ATLAS</w:t>
+        <w:t>GUIA DE ESTUDIO — ATLAS</w:t>
       </w:r>
     </w:p>
     <w:p>
@@ -2506,6 +2506,524 @@
           <w:sz w:val="22"/>
         </w:rPr>
         <w:t xml:space="preserve"> En el navegador del equipo: pantalla 8080 y API 3010. Dentro de Docker la API escucha en el 3000. El 3010 existe porque el 3000 ya lo usaba otro proyecto (INC-01).</w:t>
+      </w:r>
+    </w:p>
+    <w:p>
+      <w:pPr>
+        <w:spacing w:line="360" w:lineRule="auto" w:before="240" w:after="80"/>
+        <w:jc w:val="left"/>
+      </w:pPr>
+      <w:r>
+        <w:rPr>
+          <w:rFonts w:ascii="Arial" w:hAnsi="Arial" w:eastAsia="Arial"/>
+          <w:b/>
+          <w:color w:val="182B46"/>
+          <w:sz w:val="24"/>
+        </w:rPr>
+        <w:t>4.1 Herramientas de prueba: qué hacen y cómo funcionan</w:t>
+      </w:r>
+    </w:p>
+    <w:tbl>
+      <w:tblPr>
+        <w:tblStyle w:val="TableGrid"/>
+        <w:tblW w:type="auto" w:w="0"/>
+        <w:tblLook w:firstColumn="1" w:firstRow="1" w:lastColumn="0" w:lastRow="0" w:noHBand="0" w:noVBand="1" w:val="04A0"/>
+      </w:tblPr>
+      <w:tblGrid>
+        <w:gridCol w:w="3249"/>
+        <w:gridCol w:w="3249"/>
+        <w:gridCol w:w="3249"/>
+      </w:tblGrid>
+      <w:tr>
+        <w:tc>
+          <w:tcPr>
+            <w:tcW w:type="dxa" w:w="3249"/>
+            <w:shd w:fill="182B46" w:val="clear"/>
+          </w:tcPr>
+          <w:p>
+            <w:r/>
+            <w:r>
+              <w:rPr>
+                <w:rFonts w:ascii="Arial" w:hAnsi="Arial" w:eastAsia="Arial"/>
+                <w:b/>
+                <w:color w:val="FFFFFF"/>
+                <w:sz w:val="18"/>
+              </w:rPr>
+              <w:t>Herramienta</w:t>
+            </w:r>
+          </w:p>
+        </w:tc>
+        <w:tc>
+          <w:tcPr>
+            <w:tcW w:type="dxa" w:w="3249"/>
+            <w:shd w:fill="182B46" w:val="clear"/>
+          </w:tcPr>
+          <w:p>
+            <w:r/>
+            <w:r>
+              <w:rPr>
+                <w:rFonts w:ascii="Arial" w:hAnsi="Arial" w:eastAsia="Arial"/>
+                <w:b/>
+                <w:color w:val="FFFFFF"/>
+                <w:sz w:val="18"/>
+              </w:rPr>
+              <w:t>Qué hace</w:t>
+            </w:r>
+          </w:p>
+        </w:tc>
+        <w:tc>
+          <w:tcPr>
+            <w:tcW w:type="dxa" w:w="3249"/>
+            <w:shd w:fill="182B46" w:val="clear"/>
+          </w:tcPr>
+          <w:p>
+            <w:r/>
+            <w:r>
+              <w:rPr>
+                <w:rFonts w:ascii="Arial" w:hAnsi="Arial" w:eastAsia="Arial"/>
+                <w:b/>
+                <w:color w:val="FFFFFF"/>
+                <w:sz w:val="18"/>
+              </w:rPr>
+              <w:t>Cómo funciona en Atlas</w:t>
+            </w:r>
+          </w:p>
+        </w:tc>
+      </w:tr>
+      <w:tr>
+        <w:tc>
+          <w:tcPr>
+            <w:tcW w:type="dxa" w:w="3249"/>
+          </w:tcPr>
+          <w:p>
+            <w:r/>
+            <w:r>
+              <w:rPr>
+                <w:rFonts w:ascii="Arial" w:hAnsi="Arial" w:eastAsia="Arial"/>
+                <w:b w:val="0"/>
+                <w:sz w:val="18"/>
+              </w:rPr>
+              <w:t>Docker Compose</w:t>
+            </w:r>
+          </w:p>
+        </w:tc>
+        <w:tc>
+          <w:tcPr>
+            <w:tcW w:type="dxa" w:w="3249"/>
+          </w:tcPr>
+          <w:p>
+            <w:r/>
+            <w:r>
+              <w:rPr>
+                <w:rFonts w:ascii="Arial" w:hAnsi="Arial" w:eastAsia="Arial"/>
+                <w:b w:val="0"/>
+                <w:sz w:val="18"/>
+              </w:rPr>
+              <w:t>Deja el sistema reproducible</w:t>
+            </w:r>
+          </w:p>
+        </w:tc>
+        <w:tc>
+          <w:tcPr>
+            <w:tcW w:type="dxa" w:w="3249"/>
+          </w:tcPr>
+          <w:p>
+            <w:r/>
+            <w:r>
+              <w:rPr>
+                <w:rFonts w:ascii="Arial" w:hAnsi="Arial" w:eastAsia="Arial"/>
+                <w:b w:val="0"/>
+                <w:sz w:val="18"/>
+              </w:rPr>
+              <w:t xml:space="preserve">Lee </w:t>
+            </w:r>
+            <w:r>
+              <w:rPr>
+                <w:rFonts w:ascii="Consolas" w:hAnsi="Consolas" w:eastAsia="Consolas"/>
+                <w:b w:val="0"/>
+                <w:sz w:val="18"/>
+              </w:rPr>
+              <w:t>docker-compose.yml</w:t>
+            </w:r>
+            <w:r>
+              <w:rPr>
+                <w:rFonts w:ascii="Arial" w:hAnsi="Arial" w:eastAsia="Arial"/>
+                <w:b w:val="0"/>
+                <w:sz w:val="18"/>
+              </w:rPr>
+              <w:t xml:space="preserve"> y levanta PostgreSQL, la API Node y la pantalla nginx. Entre ellos se hablan por nombre. El equipo ve 3010 y 8080</w:t>
+            </w:r>
+          </w:p>
+        </w:tc>
+      </w:tr>
+      <w:tr>
+        <w:tc>
+          <w:tcPr>
+            <w:tcW w:type="dxa" w:w="3249"/>
+          </w:tcPr>
+          <w:p>
+            <w:r/>
+            <w:r>
+              <w:rPr>
+                <w:rFonts w:ascii="Consolas" w:hAnsi="Consolas" w:eastAsia="Consolas"/>
+                <w:b w:val="0"/>
+                <w:sz w:val="18"/>
+              </w:rPr>
+              <w:t>probar.ps1</w:t>
+            </w:r>
+          </w:p>
+        </w:tc>
+        <w:tc>
+          <w:tcPr>
+            <w:tcW w:type="dxa" w:w="3249"/>
+          </w:tcPr>
+          <w:p>
+            <w:r/>
+            <w:r>
+              <w:rPr>
+                <w:rFonts w:ascii="Arial" w:hAnsi="Arial" w:eastAsia="Arial"/>
+                <w:b w:val="0"/>
+                <w:sz w:val="18"/>
+              </w:rPr>
+              <w:t>Repite los casos funcionales y de rol</w:t>
+            </w:r>
+          </w:p>
+        </w:tc>
+        <w:tc>
+          <w:tcPr>
+            <w:tcW w:type="dxa" w:w="3249"/>
+          </w:tcPr>
+          <w:p>
+            <w:r/>
+            <w:r>
+              <w:rPr>
+                <w:rFonts w:ascii="Arial" w:hAnsi="Arial" w:eastAsia="Arial"/>
+                <w:b w:val="0"/>
+                <w:sz w:val="18"/>
+              </w:rPr>
+              <w:t xml:space="preserve">Con </w:t>
+            </w:r>
+            <w:r>
+              <w:rPr>
+                <w:rFonts w:ascii="Consolas" w:hAnsi="Consolas" w:eastAsia="Consolas"/>
+                <w:b w:val="0"/>
+                <w:sz w:val="18"/>
+              </w:rPr>
+              <w:t>curl.exe</w:t>
+            </w:r>
+            <w:r>
+              <w:rPr>
+                <w:rFonts w:ascii="Arial" w:hAnsi="Arial" w:eastAsia="Arial"/>
+                <w:b w:val="0"/>
+                <w:sz w:val="18"/>
+              </w:rPr>
+              <w:t xml:space="preserve"> manda cada petición y compara el HTTP. No lee el código: la API tiene que responder</w:t>
+            </w:r>
+          </w:p>
+        </w:tc>
+      </w:tr>
+      <w:tr>
+        <w:tc>
+          <w:tcPr>
+            <w:tcW w:type="dxa" w:w="3249"/>
+          </w:tcPr>
+          <w:p>
+            <w:r/>
+            <w:r>
+              <w:rPr>
+                <w:rFonts w:ascii="Arial" w:hAnsi="Arial" w:eastAsia="Arial"/>
+                <w:b w:val="0"/>
+                <w:sz w:val="18"/>
+              </w:rPr>
+              <w:t>k6</w:t>
+            </w:r>
+          </w:p>
+        </w:tc>
+        <w:tc>
+          <w:tcPr>
+            <w:tcW w:type="dxa" w:w="3249"/>
+          </w:tcPr>
+          <w:p>
+            <w:r/>
+            <w:r>
+              <w:rPr>
+                <w:rFonts w:ascii="Arial" w:hAnsi="Arial" w:eastAsia="Arial"/>
+                <w:b w:val="0"/>
+                <w:sz w:val="18"/>
+              </w:rPr>
+              <w:t>Mide la carga del ERS</w:t>
+            </w:r>
+          </w:p>
+        </w:tc>
+        <w:tc>
+          <w:tcPr>
+            <w:tcW w:type="dxa" w:w="3249"/>
+          </w:tcPr>
+          <w:p>
+            <w:r/>
+            <w:r>
+              <w:rPr>
+                <w:rFonts w:ascii="Consolas" w:hAnsi="Consolas" w:eastAsia="Consolas"/>
+                <w:b w:val="0"/>
+                <w:sz w:val="18"/>
+              </w:rPr>
+              <w:t>setup</w:t>
+            </w:r>
+            <w:r>
+              <w:rPr>
+                <w:rFonts w:ascii="Arial" w:hAnsi="Arial" w:eastAsia="Arial"/>
+                <w:b w:val="0"/>
+                <w:sz w:val="18"/>
+              </w:rPr>
+              <w:t xml:space="preserve"> hace un login. Luego 200 usuarios, 20 segundos, piden el listado. Calcula el p95. Código 99 = el tiempo pasó de 300 ms</w:t>
+            </w:r>
+          </w:p>
+        </w:tc>
+      </w:tr>
+      <w:tr>
+        <w:tc>
+          <w:tcPr>
+            <w:tcW w:type="dxa" w:w="3249"/>
+          </w:tcPr>
+          <w:p>
+            <w:r/>
+            <w:r>
+              <w:rPr>
+                <w:rFonts w:ascii="Arial" w:hAnsi="Arial" w:eastAsia="Arial"/>
+                <w:b w:val="0"/>
+                <w:sz w:val="18"/>
+              </w:rPr>
+              <w:t>npm audit</w:t>
+            </w:r>
+          </w:p>
+        </w:tc>
+        <w:tc>
+          <w:tcPr>
+            <w:tcW w:type="dxa" w:w="3249"/>
+          </w:tcPr>
+          <w:p>
+            <w:r/>
+            <w:r>
+              <w:rPr>
+                <w:rFonts w:ascii="Arial" w:hAnsi="Arial" w:eastAsia="Arial"/>
+                <w:b w:val="0"/>
+                <w:sz w:val="18"/>
+              </w:rPr>
+              <w:t>Busca vulnerabilidades en las librerías</w:t>
+            </w:r>
+          </w:p>
+        </w:tc>
+        <w:tc>
+          <w:tcPr>
+            <w:tcW w:type="dxa" w:w="3249"/>
+          </w:tcPr>
+          <w:p>
+            <w:r/>
+            <w:r>
+              <w:rPr>
+                <w:rFonts w:ascii="Arial" w:hAnsi="Arial" w:eastAsia="Arial"/>
+                <w:b w:val="0"/>
+                <w:sz w:val="18"/>
+              </w:rPr>
+              <w:t xml:space="preserve">Dentro del contenedor compara </w:t>
+            </w:r>
+            <w:r>
+              <w:rPr>
+                <w:rFonts w:ascii="Consolas" w:hAnsi="Consolas" w:eastAsia="Consolas"/>
+                <w:b w:val="0"/>
+                <w:sz w:val="18"/>
+              </w:rPr>
+              <w:t>node_modules</w:t>
+            </w:r>
+            <w:r>
+              <w:rPr>
+                <w:rFonts w:ascii="Arial" w:hAnsi="Arial" w:eastAsia="Arial"/>
+                <w:b w:val="0"/>
+                <w:sz w:val="18"/>
+              </w:rPr>
+              <w:t xml:space="preserve"> con la base de avisos. No ataca la API. Código 1 = hay hallazgos</w:t>
+            </w:r>
+          </w:p>
+        </w:tc>
+      </w:tr>
+      <w:tr>
+        <w:tc>
+          <w:tcPr>
+            <w:tcW w:type="dxa" w:w="3249"/>
+          </w:tcPr>
+          <w:p>
+            <w:r/>
+            <w:r>
+              <w:rPr>
+                <w:rFonts w:ascii="Arial" w:hAnsi="Arial" w:eastAsia="Arial"/>
+                <w:b w:val="0"/>
+                <w:sz w:val="18"/>
+              </w:rPr>
+              <w:t>Trivy</w:t>
+            </w:r>
+          </w:p>
+        </w:tc>
+        <w:tc>
+          <w:tcPr>
+            <w:tcW w:type="dxa" w:w="3249"/>
+          </w:tcPr>
+          <w:p>
+            <w:r/>
+            <w:r>
+              <w:rPr>
+                <w:rFonts w:ascii="Arial" w:hAnsi="Arial" w:eastAsia="Arial"/>
+                <w:b w:val="0"/>
+                <w:sz w:val="18"/>
+              </w:rPr>
+              <w:t>Busca CVE en la imagen ya armada</w:t>
+            </w:r>
+          </w:p>
+        </w:tc>
+        <w:tc>
+          <w:tcPr>
+            <w:tcW w:type="dxa" w:w="3249"/>
+          </w:tcPr>
+          <w:p>
+            <w:r/>
+            <w:r>
+              <w:rPr>
+                <w:rFonts w:ascii="Arial" w:hAnsi="Arial" w:eastAsia="Arial"/>
+                <w:b w:val="0"/>
+                <w:sz w:val="18"/>
+              </w:rPr>
+              <w:t xml:space="preserve">Recorre las capas de </w:t>
+            </w:r>
+            <w:r>
+              <w:rPr>
+                <w:rFonts w:ascii="Consolas" w:hAnsi="Consolas" w:eastAsia="Consolas"/>
+                <w:b w:val="0"/>
+                <w:sz w:val="18"/>
+              </w:rPr>
+              <w:t>atlas-api</w:t>
+            </w:r>
+            <w:r>
+              <w:rPr>
+                <w:rFonts w:ascii="Arial" w:hAnsi="Arial" w:eastAsia="Arial"/>
+                <w:b w:val="0"/>
+                <w:sz w:val="18"/>
+              </w:rPr>
+              <w:t xml:space="preserve">: Alpine y los </w:t>
+            </w:r>
+            <w:r>
+              <w:rPr>
+                <w:rFonts w:ascii="Consolas" w:hAnsi="Consolas" w:eastAsia="Consolas"/>
+                <w:b w:val="0"/>
+                <w:sz w:val="18"/>
+              </w:rPr>
+              <w:t>package.json</w:t>
+            </w:r>
+            <w:r>
+              <w:rPr>
+                <w:rFonts w:ascii="Arial" w:hAnsi="Arial" w:eastAsia="Arial"/>
+                <w:b w:val="0"/>
+                <w:sz w:val="18"/>
+              </w:rPr>
+              <w:t>. Incluye herramientas de Node que npm audit de la app no lista</w:t>
+            </w:r>
+          </w:p>
+        </w:tc>
+      </w:tr>
+      <w:tr>
+        <w:tc>
+          <w:tcPr>
+            <w:tcW w:type="dxa" w:w="3249"/>
+          </w:tcPr>
+          <w:p>
+            <w:r/>
+            <w:r>
+              <w:rPr>
+                <w:rFonts w:ascii="Arial" w:hAnsi="Arial" w:eastAsia="Arial"/>
+                <w:b w:val="0"/>
+                <w:sz w:val="18"/>
+              </w:rPr>
+              <w:t>OWASP ZAP baseline</w:t>
+            </w:r>
+          </w:p>
+        </w:tc>
+        <w:tc>
+          <w:tcPr>
+            <w:tcW w:type="dxa" w:w="3249"/>
+          </w:tcPr>
+          <w:p>
+            <w:r/>
+            <w:r>
+              <w:rPr>
+                <w:rFonts w:ascii="Arial" w:hAnsi="Arial" w:eastAsia="Arial"/>
+                <w:b w:val="0"/>
+                <w:sz w:val="18"/>
+              </w:rPr>
+              <w:t>Revisa la pantalla encendida</w:t>
+            </w:r>
+          </w:p>
+        </w:tc>
+        <w:tc>
+          <w:tcPr>
+            <w:tcW w:type="dxa" w:w="3249"/>
+          </w:tcPr>
+          <w:p>
+            <w:r/>
+            <w:r>
+              <w:rPr>
+                <w:rFonts w:ascii="Arial" w:hAnsi="Arial" w:eastAsia="Arial"/>
+                <w:b w:val="0"/>
+                <w:sz w:val="18"/>
+              </w:rPr>
+              <w:t xml:space="preserve">Recorre enlaces y mira cabeceras, sin explotar. Apunta al puerto 8080. </w:t>
+            </w:r>
+            <w:r>
+              <w:rPr>
+                <w:rFonts w:ascii="Consolas" w:hAnsi="Consolas" w:eastAsia="Consolas"/>
+                <w:b w:val="0"/>
+                <w:sz w:val="18"/>
+              </w:rPr>
+              <w:t>FAIL-NEW: 0</w:t>
+            </w:r>
+            <w:r>
+              <w:rPr>
+                <w:rFonts w:ascii="Arial" w:hAnsi="Arial" w:eastAsia="Arial"/>
+                <w:b w:val="0"/>
+                <w:sz w:val="18"/>
+              </w:rPr>
+              <w:t xml:space="preserve"> y los avisos son cabeceras que nginx no envía</w:t>
+            </w:r>
+          </w:p>
+        </w:tc>
+      </w:tr>
+    </w:tbl>
+    <w:p/>
+    <w:p>
+      <w:pPr>
+        <w:spacing w:line="360" w:lineRule="auto" w:before="0" w:after="120"/>
+        <w:jc w:val="both"/>
+      </w:pPr>
+      <w:r>
+        <w:rPr>
+          <w:rFonts w:ascii="Arial" w:hAnsi="Arial" w:eastAsia="Arial"/>
+          <w:b w:val="0"/>
+          <w:sz w:val="22"/>
+        </w:rPr>
+        <w:t xml:space="preserve">Para decirlo en la defensa: </w:t>
+      </w:r>
+      <w:r>
+        <w:rPr>
+          <w:rFonts w:ascii="Consolas" w:hAnsi="Consolas" w:eastAsia="Consolas"/>
+          <w:b w:val="0"/>
+          <w:sz w:val="22"/>
+        </w:rPr>
+        <w:t>probar.ps1</w:t>
+      </w:r>
+      <w:r>
+        <w:rPr>
+          <w:rFonts w:ascii="Arial" w:hAnsi="Arial" w:eastAsia="Arial"/>
+          <w:b w:val="0"/>
+          <w:sz w:val="22"/>
+        </w:rPr>
+        <w:t>, k6 y ZAP necesitan Atlas encendido (prueba dinámica). npm audit y Trivy leen dependencias e imagen (prueba estática). ZAP en este trabajo miró la pantalla, no el puerto de la API.</w:t>
       </w:r>
     </w:p>
     <w:p>
@@ -7461,7 +7979,7 @@
         <w:color w:val="646B73"/>
         <w:sz w:val="18"/>
       </w:rPr>
-      <w:t>ISY1102  •  Guía de estudio Atlas</w:t>
+      <w:t>ISY1102  •  Guia de estudio Atlas</w:t>
     </w:r>
   </w:p>
 </w:ftr>

</xml_diff>